<commit_message>
add: adicionado a possibilidade do admin remover e adicionar serviços. Também foi adicionado as fotos ao relatório.
</commit_message>
<xml_diff>
--- a/Modelos/definitivos/Modelo definitivo.docx
+++ b/Modelos/definitivos/Modelo definitivo.docx
@@ -191,6 +191,7 @@
               </w:rPr>
               <w:t>{{</w:t>
             </w:r>
+            <w:proofErr w:type="spellStart"/>
             <w:r>
               <w:rPr>
                 <w:color w:val="11437E"/>
@@ -205,7 +206,16 @@
                 <w:sz w:val="18"/>
                 <w:szCs w:val="18"/>
               </w:rPr>
-              <w:t>starttime}}</w:t>
+              <w:t>starttime</w:t>
+            </w:r>
+            <w:proofErr w:type="spellEnd"/>
+            <w:r>
+              <w:rPr>
+                <w:color w:val="11437E"/>
+                <w:sz w:val="18"/>
+                <w:szCs w:val="18"/>
+              </w:rPr>
+              <w:t>}}</w:t>
             </w:r>
           </w:p>
         </w:tc>
@@ -238,7 +248,25 @@
                 <w:sz w:val="18"/>
                 <w:szCs w:val="18"/>
               </w:rPr>
-              <w:t>{{lunchinterval}}</w:t>
+              <w:t>{{</w:t>
+            </w:r>
+            <w:proofErr w:type="spellStart"/>
+            <w:r>
+              <w:rPr>
+                <w:color w:val="11437E"/>
+                <w:sz w:val="18"/>
+                <w:szCs w:val="18"/>
+              </w:rPr>
+              <w:t>lunchinterval</w:t>
+            </w:r>
+            <w:proofErr w:type="spellEnd"/>
+            <w:r>
+              <w:rPr>
+                <w:color w:val="11437E"/>
+                <w:sz w:val="18"/>
+                <w:szCs w:val="18"/>
+              </w:rPr>
+              <w:t>}}</w:t>
             </w:r>
           </w:p>
         </w:tc>
@@ -273,13 +301,23 @@
               </w:rPr>
               <w:t>{{</w:t>
             </w:r>
-            <w:r>
-              <w:rPr>
-                <w:color w:val="11437E"/>
-                <w:sz w:val="18"/>
-                <w:szCs w:val="18"/>
-              </w:rPr>
-              <w:t>nightstarttime}}</w:t>
+            <w:proofErr w:type="spellStart"/>
+            <w:r>
+              <w:rPr>
+                <w:color w:val="11437E"/>
+                <w:sz w:val="18"/>
+                <w:szCs w:val="18"/>
+              </w:rPr>
+              <w:t>nightstarttime</w:t>
+            </w:r>
+            <w:proofErr w:type="spellEnd"/>
+            <w:r>
+              <w:rPr>
+                <w:color w:val="11437E"/>
+                <w:sz w:val="18"/>
+                <w:szCs w:val="18"/>
+              </w:rPr>
+              <w:t>}}</w:t>
             </w:r>
           </w:p>
         </w:tc>
@@ -312,7 +350,25 @@
                 <w:sz w:val="18"/>
                 <w:szCs w:val="18"/>
               </w:rPr>
-              <w:t>{{dinnerinterval}}</w:t>
+              <w:t>{{</w:t>
+            </w:r>
+            <w:proofErr w:type="spellStart"/>
+            <w:r>
+              <w:rPr>
+                <w:color w:val="11437E"/>
+                <w:sz w:val="18"/>
+                <w:szCs w:val="18"/>
+              </w:rPr>
+              <w:t>dinnerinterval</w:t>
+            </w:r>
+            <w:proofErr w:type="spellEnd"/>
+            <w:r>
+              <w:rPr>
+                <w:color w:val="11437E"/>
+                <w:sz w:val="18"/>
+                <w:szCs w:val="18"/>
+              </w:rPr>
+              <w:t>}}</w:t>
             </w:r>
           </w:p>
         </w:tc>
@@ -352,6 +408,7 @@
               </w:rPr>
               <w:t>{{</w:t>
             </w:r>
+            <w:proofErr w:type="spellStart"/>
             <w:r>
               <w:rPr>
                 <w:color w:val="11437E"/>
@@ -366,7 +423,16 @@
                 <w:sz w:val="18"/>
                 <w:szCs w:val="18"/>
               </w:rPr>
-              <w:t>time}}</w:t>
+              <w:t>time</w:t>
+            </w:r>
+            <w:proofErr w:type="spellEnd"/>
+            <w:r>
+              <w:rPr>
+                <w:color w:val="11437E"/>
+                <w:sz w:val="18"/>
+                <w:szCs w:val="18"/>
+              </w:rPr>
+              <w:t>}}</w:t>
             </w:r>
           </w:p>
           <w:p>
@@ -413,6 +479,7 @@
               </w:rPr>
               <w:t>{{</w:t>
             </w:r>
+            <w:proofErr w:type="spellStart"/>
             <w:r>
               <w:rPr>
                 <w:color w:val="11437E"/>
@@ -443,7 +510,16 @@
                 <w:sz w:val="18"/>
                 <w:szCs w:val="18"/>
               </w:rPr>
-              <w:t>aboratorscount}}</w:t>
+              <w:t>aboratorscount</w:t>
+            </w:r>
+            <w:proofErr w:type="spellEnd"/>
+            <w:r>
+              <w:rPr>
+                <w:color w:val="11437E"/>
+                <w:sz w:val="18"/>
+                <w:szCs w:val="18"/>
+              </w:rPr>
+              <w:t>}}</w:t>
             </w:r>
           </w:p>
         </w:tc>
@@ -476,7 +552,25 @@
                 <w:sz w:val="18"/>
                 <w:szCs w:val="18"/>
               </w:rPr>
-              <w:t>{{nightexittime}}</w:t>
+              <w:t>{{</w:t>
+            </w:r>
+            <w:proofErr w:type="spellStart"/>
+            <w:r>
+              <w:rPr>
+                <w:color w:val="11437E"/>
+                <w:sz w:val="18"/>
+                <w:szCs w:val="18"/>
+              </w:rPr>
+              <w:t>nightexittime</w:t>
+            </w:r>
+            <w:proofErr w:type="spellEnd"/>
+            <w:r>
+              <w:rPr>
+                <w:color w:val="11437E"/>
+                <w:sz w:val="18"/>
+                <w:szCs w:val="18"/>
+              </w:rPr>
+              <w:t>}}</w:t>
             </w:r>
           </w:p>
           <w:p>
@@ -521,7 +615,25 @@
                 <w:sz w:val="18"/>
                 <w:szCs w:val="18"/>
               </w:rPr>
-              <w:t>{{nightcollaboratorscount}}</w:t>
+              <w:t>{{</w:t>
+            </w:r>
+            <w:proofErr w:type="spellStart"/>
+            <w:r>
+              <w:rPr>
+                <w:color w:val="11437E"/>
+                <w:sz w:val="18"/>
+                <w:szCs w:val="18"/>
+              </w:rPr>
+              <w:t>nightcollaboratorscount</w:t>
+            </w:r>
+            <w:proofErr w:type="spellEnd"/>
+            <w:r>
+              <w:rPr>
+                <w:color w:val="11437E"/>
+                <w:sz w:val="18"/>
+                <w:szCs w:val="18"/>
+              </w:rPr>
+              <w:t>}}</w:t>
             </w:r>
           </w:p>
         </w:tc>
@@ -584,7 +696,25 @@
                 <w:sz w:val="18"/>
                 <w:szCs w:val="18"/>
               </w:rPr>
-              <w:t>{{dayovertime}}</w:t>
+              <w:t>{{</w:t>
+            </w:r>
+            <w:proofErr w:type="spellStart"/>
+            <w:r>
+              <w:rPr>
+                <w:color w:val="11437E"/>
+                <w:sz w:val="18"/>
+                <w:szCs w:val="18"/>
+              </w:rPr>
+              <w:t>dayovertime</w:t>
+            </w:r>
+            <w:proofErr w:type="spellEnd"/>
+            <w:r>
+              <w:rPr>
+                <w:color w:val="11437E"/>
+                <w:sz w:val="18"/>
+                <w:szCs w:val="18"/>
+              </w:rPr>
+              <w:t>}}</w:t>
             </w:r>
           </w:p>
         </w:tc>
@@ -676,7 +806,25 @@
                 <w:sz w:val="18"/>
                 <w:szCs w:val="18"/>
               </w:rPr>
-              <w:t>{{nightovertime}}</w:t>
+              <w:t>{{</w:t>
+            </w:r>
+            <w:proofErr w:type="spellStart"/>
+            <w:r>
+              <w:rPr>
+                <w:color w:val="11437E"/>
+                <w:sz w:val="18"/>
+                <w:szCs w:val="18"/>
+              </w:rPr>
+              <w:t>nightovertime</w:t>
+            </w:r>
+            <w:proofErr w:type="spellEnd"/>
+            <w:r>
+              <w:rPr>
+                <w:color w:val="11437E"/>
+                <w:sz w:val="18"/>
+                <w:szCs w:val="18"/>
+              </w:rPr>
+              <w:t>}}</w:t>
             </w:r>
           </w:p>
         </w:tc>
@@ -712,7 +860,25 @@
                 <w:sz w:val="18"/>
                 <w:szCs w:val="18"/>
               </w:rPr>
-              <w:t>{{standbymotive}}</w:t>
+              <w:t>{{</w:t>
+            </w:r>
+            <w:proofErr w:type="spellStart"/>
+            <w:r>
+              <w:rPr>
+                <w:color w:val="11437E"/>
+                <w:sz w:val="18"/>
+                <w:szCs w:val="18"/>
+              </w:rPr>
+              <w:t>standbymotive</w:t>
+            </w:r>
+            <w:proofErr w:type="spellEnd"/>
+            <w:r>
+              <w:rPr>
+                <w:color w:val="11437E"/>
+                <w:sz w:val="18"/>
+                <w:szCs w:val="18"/>
+              </w:rPr>
+              <w:t>}}</w:t>
             </w:r>
           </w:p>
         </w:tc>
@@ -755,7 +921,27 @@
                 <w:szCs w:val="18"/>
                 <w:u w:val="single"/>
               </w:rPr>
-              <w:t>{{overtimecomment}}</w:t>
+              <w:t>{{</w:t>
+            </w:r>
+            <w:proofErr w:type="spellStart"/>
+            <w:r>
+              <w:rPr>
+                <w:color w:val="11437E"/>
+                <w:sz w:val="18"/>
+                <w:szCs w:val="18"/>
+                <w:u w:val="single"/>
+              </w:rPr>
+              <w:t>overtimecomment</w:t>
+            </w:r>
+            <w:proofErr w:type="spellEnd"/>
+            <w:r>
+              <w:rPr>
+                <w:color w:val="11437E"/>
+                <w:sz w:val="18"/>
+                <w:szCs w:val="18"/>
+                <w:u w:val="single"/>
+              </w:rPr>
+              <w:t>}}</w:t>
             </w:r>
           </w:p>
         </w:tc>
@@ -1016,7 +1202,25 @@
                 <w:sz w:val="18"/>
                 <w:szCs w:val="18"/>
               </w:rPr>
-              <w:t>{{collaboratorname}}</w:t>
+              <w:t>{{</w:t>
+            </w:r>
+            <w:proofErr w:type="spellStart"/>
+            <w:r>
+              <w:rPr>
+                <w:color w:val="11437E"/>
+                <w:sz w:val="18"/>
+                <w:szCs w:val="18"/>
+              </w:rPr>
+              <w:t>collaboratorname</w:t>
+            </w:r>
+            <w:proofErr w:type="spellEnd"/>
+            <w:r>
+              <w:rPr>
+                <w:color w:val="11437E"/>
+                <w:sz w:val="18"/>
+                <w:szCs w:val="18"/>
+              </w:rPr>
+              <w:t>}}</w:t>
             </w:r>
           </w:p>
         </w:tc>
@@ -1041,7 +1245,25 @@
                 <w:sz w:val="18"/>
                 <w:szCs w:val="18"/>
               </w:rPr>
-              <w:t>{{collaboratorposition}}</w:t>
+              <w:t>{{</w:t>
+            </w:r>
+            <w:proofErr w:type="spellStart"/>
+            <w:r>
+              <w:rPr>
+                <w:color w:val="11437E"/>
+                <w:sz w:val="18"/>
+                <w:szCs w:val="18"/>
+              </w:rPr>
+              <w:t>collaboratorposition</w:t>
+            </w:r>
+            <w:proofErr w:type="spellEnd"/>
+            <w:r>
+              <w:rPr>
+                <w:color w:val="11437E"/>
+                <w:sz w:val="18"/>
+                <w:szCs w:val="18"/>
+              </w:rPr>
+              <w:t>}}</w:t>
             </w:r>
           </w:p>
         </w:tc>
@@ -1068,6 +1290,7 @@
               </w:rPr>
               <w:t>{{</w:t>
             </w:r>
+            <w:proofErr w:type="spellStart"/>
             <w:r>
               <w:rPr>
                 <w:color w:val="11437E"/>
@@ -1077,6 +1300,7 @@
               </w:rPr>
               <w:t>collaboratorshift</w:t>
             </w:r>
+            <w:proofErr w:type="spellEnd"/>
             <w:r>
               <w:rPr>
                 <w:color w:val="11437E"/>
@@ -1184,7 +1408,25 @@
                 <w:sz w:val="18"/>
                 <w:szCs w:val="18"/>
               </w:rPr>
-              <w:t>{{activities}}</w:t>
+              <w:t>{{</w:t>
+            </w:r>
+            <w:proofErr w:type="spellStart"/>
+            <w:r>
+              <w:rPr>
+                <w:color w:val="11437E"/>
+                <w:sz w:val="18"/>
+                <w:szCs w:val="18"/>
+              </w:rPr>
+              <w:t>activities</w:t>
+            </w:r>
+            <w:proofErr w:type="spellEnd"/>
+            <w:r>
+              <w:rPr>
+                <w:color w:val="11437E"/>
+                <w:sz w:val="18"/>
+                <w:szCs w:val="18"/>
+              </w:rPr>
+              <w:t>}}</w:t>
             </w:r>
           </w:p>
         </w:tc>
@@ -1308,7 +1550,29 @@
                 <w:sz w:val="24"/>
                 <w:szCs w:val="24"/>
               </w:rPr>
-              <w:t>Serviço {{servicecount}}</w:t>
+              <w:t>Serviço {{</w:t>
+            </w:r>
+            <w:proofErr w:type="spellStart"/>
+            <w:r>
+              <w:rPr>
+                <w:b/>
+                <w:bCs/>
+                <w:color w:val="E8E8E8"/>
+                <w:sz w:val="24"/>
+                <w:szCs w:val="24"/>
+              </w:rPr>
+              <w:t>servicecount</w:t>
+            </w:r>
+            <w:proofErr w:type="spellEnd"/>
+            <w:r>
+              <w:rPr>
+                <w:b/>
+                <w:bCs/>
+                <w:color w:val="E8E8E8"/>
+                <w:sz w:val="24"/>
+                <w:szCs w:val="24"/>
+              </w:rPr>
+              <w:t>}}</w:t>
             </w:r>
           </w:p>
         </w:tc>
@@ -1361,7 +1625,25 @@
                 <w:sz w:val="18"/>
                 <w:szCs w:val="18"/>
               </w:rPr>
-              <w:t>{{servicename}}</w:t>
+              <w:t>{{</w:t>
+            </w:r>
+            <w:proofErr w:type="spellStart"/>
+            <w:r>
+              <w:rPr>
+                <w:color w:val="11437E"/>
+                <w:sz w:val="18"/>
+                <w:szCs w:val="18"/>
+              </w:rPr>
+              <w:t>servicename</w:t>
+            </w:r>
+            <w:proofErr w:type="spellEnd"/>
+            <w:r>
+              <w:rPr>
+                <w:color w:val="11437E"/>
+                <w:sz w:val="18"/>
+                <w:szCs w:val="18"/>
+              </w:rPr>
+              <w:t>}}</w:t>
             </w:r>
           </w:p>
         </w:tc>
@@ -1400,7 +1682,25 @@
                 <w:sz w:val="18"/>
                 <w:szCs w:val="18"/>
               </w:rPr>
-              <w:t>{{starttime}}</w:t>
+              <w:t>{{</w:t>
+            </w:r>
+            <w:proofErr w:type="spellStart"/>
+            <w:r>
+              <w:rPr>
+                <w:color w:val="11437E"/>
+                <w:sz w:val="18"/>
+                <w:szCs w:val="18"/>
+              </w:rPr>
+              <w:t>starttime</w:t>
+            </w:r>
+            <w:proofErr w:type="spellEnd"/>
+            <w:r>
+              <w:rPr>
+                <w:color w:val="11437E"/>
+                <w:sz w:val="18"/>
+                <w:szCs w:val="18"/>
+              </w:rPr>
+              <w:t>}}</w:t>
             </w:r>
           </w:p>
         </w:tc>
@@ -1439,7 +1739,25 @@
                 <w:sz w:val="18"/>
                 <w:szCs w:val="18"/>
               </w:rPr>
-              <w:t>{{endtime}}</w:t>
+              <w:t>{{</w:t>
+            </w:r>
+            <w:proofErr w:type="spellStart"/>
+            <w:r>
+              <w:rPr>
+                <w:color w:val="11437E"/>
+                <w:sz w:val="18"/>
+                <w:szCs w:val="18"/>
+              </w:rPr>
+              <w:t>endtime</w:t>
+            </w:r>
+            <w:proofErr w:type="spellEnd"/>
+            <w:r>
+              <w:rPr>
+                <w:color w:val="11437E"/>
+                <w:sz w:val="18"/>
+                <w:szCs w:val="18"/>
+              </w:rPr>
+              <w:t>}}</w:t>
             </w:r>
           </w:p>
         </w:tc>
@@ -1484,7 +1802,25 @@
                 <w:sz w:val="18"/>
                 <w:szCs w:val="18"/>
               </w:rPr>
-              <w:t>{{equipament}}</w:t>
+              <w:t>{{</w:t>
+            </w:r>
+            <w:proofErr w:type="spellStart"/>
+            <w:r>
+              <w:rPr>
+                <w:color w:val="11437E"/>
+                <w:sz w:val="18"/>
+                <w:szCs w:val="18"/>
+              </w:rPr>
+              <w:t>equipament</w:t>
+            </w:r>
+            <w:proofErr w:type="spellEnd"/>
+            <w:r>
+              <w:rPr>
+                <w:color w:val="11437E"/>
+                <w:sz w:val="18"/>
+                <w:szCs w:val="18"/>
+              </w:rPr>
+              <w:t>}}</w:t>
             </w:r>
           </w:p>
         </w:tc>
@@ -1515,7 +1851,27 @@
                 <w:sz w:val="18"/>
                 <w:szCs w:val="18"/>
               </w:rPr>
-              <w:t>{{statementone}}:</w:t>
+              <w:t>{{</w:t>
+            </w:r>
+            <w:proofErr w:type="spellStart"/>
+            <w:r>
+              <w:rPr>
+                <w:b/>
+                <w:bCs/>
+                <w:sz w:val="18"/>
+                <w:szCs w:val="18"/>
+              </w:rPr>
+              <w:t>statementone</w:t>
+            </w:r>
+            <w:proofErr w:type="spellEnd"/>
+            <w:r>
+              <w:rPr>
+                <w:b/>
+                <w:bCs/>
+                <w:sz w:val="18"/>
+                <w:szCs w:val="18"/>
+              </w:rPr>
+              <w:t>}}</w:t>
             </w:r>
             <w:r>
               <w:rPr>
@@ -1534,6 +1890,7 @@
               </w:rPr>
               <w:t>{{</w:t>
             </w:r>
+            <w:proofErr w:type="spellStart"/>
             <w:r>
               <w:rPr>
                 <w:color w:val="11437E"/>
@@ -1542,6 +1899,7 @@
               </w:rPr>
               <w:t>statementdataone</w:t>
             </w:r>
+            <w:proofErr w:type="spellEnd"/>
             <w:r>
               <w:rPr>
                 <w:color w:val="11437E"/>
@@ -1579,7 +1937,27 @@
                 <w:sz w:val="18"/>
                 <w:szCs w:val="18"/>
               </w:rPr>
-              <w:t>{{statementtwo}}:</w:t>
+              <w:t>{{</w:t>
+            </w:r>
+            <w:proofErr w:type="spellStart"/>
+            <w:r>
+              <w:rPr>
+                <w:b/>
+                <w:bCs/>
+                <w:sz w:val="18"/>
+                <w:szCs w:val="18"/>
+              </w:rPr>
+              <w:t>statementtwo</w:t>
+            </w:r>
+            <w:proofErr w:type="spellEnd"/>
+            <w:r>
+              <w:rPr>
+                <w:b/>
+                <w:bCs/>
+                <w:sz w:val="18"/>
+                <w:szCs w:val="18"/>
+              </w:rPr>
+              <w:t>}}</w:t>
             </w:r>
             <w:r>
               <w:rPr>
@@ -1596,7 +1974,25 @@
                 <w:sz w:val="18"/>
                 <w:szCs w:val="18"/>
               </w:rPr>
-              <w:t>{{statementdatatwo}}</w:t>
+              <w:t>{{</w:t>
+            </w:r>
+            <w:proofErr w:type="spellStart"/>
+            <w:r>
+              <w:rPr>
+                <w:color w:val="11437E"/>
+                <w:sz w:val="18"/>
+                <w:szCs w:val="18"/>
+              </w:rPr>
+              <w:t>statementdatatwo</w:t>
+            </w:r>
+            <w:proofErr w:type="spellEnd"/>
+            <w:r>
+              <w:rPr>
+                <w:color w:val="11437E"/>
+                <w:sz w:val="18"/>
+                <w:szCs w:val="18"/>
+              </w:rPr>
+              <w:t>}}</w:t>
             </w:r>
           </w:p>
         </w:tc>
@@ -1712,15 +2108,53 @@
                 <w:sz w:val="18"/>
                 <w:szCs w:val="18"/>
               </w:rPr>
-              <w:t xml:space="preserve">{{infostatement}}: </w:t>
-            </w:r>
-            <w:r>
-              <w:rPr>
-                <w:color w:val="11437E"/>
-                <w:sz w:val="18"/>
-                <w:szCs w:val="18"/>
-              </w:rPr>
-              <w:t>{{info}}</w:t>
+              <w:t>{{</w:t>
+            </w:r>
+            <w:proofErr w:type="spellStart"/>
+            <w:r>
+              <w:rPr>
+                <w:b/>
+                <w:bCs/>
+                <w:sz w:val="18"/>
+                <w:szCs w:val="18"/>
+              </w:rPr>
+              <w:t>infostatement</w:t>
+            </w:r>
+            <w:proofErr w:type="spellEnd"/>
+            <w:r>
+              <w:rPr>
+                <w:b/>
+                <w:bCs/>
+                <w:sz w:val="18"/>
+                <w:szCs w:val="18"/>
+              </w:rPr>
+              <w:t xml:space="preserve">}} </w:t>
+            </w:r>
+            <w:r>
+              <w:rPr>
+                <w:color w:val="11437E"/>
+                <w:sz w:val="18"/>
+                <w:szCs w:val="18"/>
+              </w:rPr>
+              <w:t>{{</w:t>
+            </w:r>
+            <w:proofErr w:type="spellStart"/>
+            <w:r>
+              <w:rPr>
+                <w:color w:val="11437E"/>
+                <w:sz w:val="18"/>
+                <w:szCs w:val="18"/>
+              </w:rPr>
+              <w:t>info</w:t>
+            </w:r>
+            <w:proofErr w:type="spellEnd"/>
+            <w:r>
+              <w:rPr>
+                <w:color w:val="11437E"/>
+                <w:sz w:val="18"/>
+                <w:szCs w:val="18"/>
+              </w:rPr>
+              <w:t>}}</w:t>
             </w:r>
           </w:p>
         </w:tc>
@@ -1766,7 +2200,25 @@
                 <w:sz w:val="18"/>
                 <w:szCs w:val="18"/>
               </w:rPr>
-              <w:t>{{servicecollaborators}}</w:t>
+              <w:t>{{</w:t>
+            </w:r>
+            <w:proofErr w:type="spellStart"/>
+            <w:r>
+              <w:rPr>
+                <w:color w:val="11437E"/>
+                <w:sz w:val="18"/>
+                <w:szCs w:val="18"/>
+              </w:rPr>
+              <w:t>servicecollaborators</w:t>
+            </w:r>
+            <w:proofErr w:type="spellEnd"/>
+            <w:r>
+              <w:rPr>
+                <w:color w:val="11437E"/>
+                <w:sz w:val="18"/>
+                <w:szCs w:val="18"/>
+              </w:rPr>
+              <w:t>}}</w:t>
             </w:r>
           </w:p>
         </w:tc>
@@ -1858,7 +2310,162 @@
                 <w:sz w:val="18"/>
                 <w:szCs w:val="18"/>
               </w:rPr>
-              <w:t>{{obs}}</w:t>
+              <w:t>{{</w:t>
+            </w:r>
+            <w:proofErr w:type="spellStart"/>
+            <w:r>
+              <w:rPr>
+                <w:color w:val="11437E"/>
+                <w:sz w:val="18"/>
+                <w:szCs w:val="18"/>
+              </w:rPr>
+              <w:t>obs</w:t>
+            </w:r>
+            <w:proofErr w:type="spellEnd"/>
+            <w:r>
+              <w:rPr>
+                <w:color w:val="11437E"/>
+                <w:sz w:val="18"/>
+                <w:szCs w:val="18"/>
+              </w:rPr>
+              <w:t>}}</w:t>
+            </w:r>
+          </w:p>
+        </w:tc>
+      </w:tr>
+    </w:tbl>
+    <w:p>
+      <w:pPr>
+        <w:widowControl w:val="0"/>
+        <w:pBdr>
+          <w:top w:val="nil"/>
+          <w:left w:val="nil"/>
+          <w:bottom w:val="nil"/>
+          <w:right w:val="nil"/>
+          <w:between w:val="nil"/>
+        </w:pBdr>
+        <w:rPr>
+          <w:b/>
+          <w:bCs/>
+          <w:color w:val="30503A"/>
+          <w:sz w:val="28"/>
+          <w:szCs w:val="28"/>
+        </w:rPr>
+      </w:pPr>
+    </w:p>
+    <w:tbl>
+      <w:tblPr>
+        <w:tblW w:w="10320" w:type="dxa"/>
+        <w:jc w:val="center"/>
+        <w:tblBorders>
+          <w:top w:val="single" w:sz="8" w:space="0" w:color="000000"/>
+          <w:left w:val="single" w:sz="8" w:space="0" w:color="000000"/>
+          <w:bottom w:val="single" w:sz="8" w:space="0" w:color="000000"/>
+          <w:right w:val="single" w:sz="8" w:space="0" w:color="000000"/>
+          <w:insideH w:val="single" w:sz="8" w:space="0" w:color="000000"/>
+          <w:insideV w:val="single" w:sz="8" w:space="0" w:color="000000"/>
+        </w:tblBorders>
+        <w:tblLayout w:type="fixed"/>
+        <w:tblLook w:val="0600" w:firstRow="0" w:lastRow="0" w:firstColumn="0" w:lastColumn="0" w:noHBand="1" w:noVBand="1"/>
+      </w:tblPr>
+      <w:tblGrid>
+        <w:gridCol w:w="10320"/>
+      </w:tblGrid>
+      <w:tr>
+        <w:trPr>
+          <w:cantSplit/>
+          <w:trHeight w:val="275"/>
+          <w:tblHeader/>
+          <w:jc w:val="center"/>
+        </w:trPr>
+        <w:tc>
+          <w:tcPr>
+            <w:tcW w:w="10320" w:type="dxa"/>
+            <w:shd w:val="clear" w:color="auto" w:fill="30503A"/>
+            <w:tcMar>
+              <w:top w:w="100" w:type="dxa"/>
+              <w:left w:w="100" w:type="dxa"/>
+              <w:bottom w:w="100" w:type="dxa"/>
+              <w:right w:w="100" w:type="dxa"/>
+            </w:tcMar>
+          </w:tcPr>
+          <w:p>
+            <w:pPr>
+              <w:widowControl w:val="0"/>
+              <w:spacing w:line="240" w:lineRule="auto"/>
+              <w:jc w:val="center"/>
+              <w:rPr>
+                <w:b/>
+                <w:bCs/>
+                <w:color w:val="E8E8E8"/>
+                <w:sz w:val="24"/>
+                <w:szCs w:val="24"/>
+              </w:rPr>
+            </w:pPr>
+            <w:r>
+              <w:rPr>
+                <w:b/>
+                <w:bCs/>
+                <w:color w:val="E8E8E8"/>
+                <w:sz w:val="24"/>
+                <w:szCs w:val="24"/>
+              </w:rPr>
+              <w:t>Fotos</w:t>
+            </w:r>
+          </w:p>
+        </w:tc>
+      </w:tr>
+      <w:tr>
+        <w:trPr>
+          <w:trHeight w:val="4230"/>
+          <w:jc w:val="center"/>
+        </w:trPr>
+        <w:tc>
+          <w:tcPr>
+            <w:tcW w:w="10320" w:type="dxa"/>
+            <w:tcMar>
+              <w:top w:w="100" w:type="dxa"/>
+              <w:left w:w="100" w:type="dxa"/>
+              <w:bottom w:w="100" w:type="dxa"/>
+              <w:right w:w="100" w:type="dxa"/>
+            </w:tcMar>
+          </w:tcPr>
+          <w:p>
+            <w:pPr>
+              <w:widowControl w:val="0"/>
+              <w:spacing w:line="240" w:lineRule="auto"/>
+              <w:rPr>
+                <w:color w:val="11437E"/>
+                <w:sz w:val="18"/>
+                <w:szCs w:val="18"/>
+                <w:u w:val="single"/>
+              </w:rPr>
+            </w:pPr>
+            <w:r>
+              <w:rPr>
+                <w:color w:val="11437E"/>
+                <w:sz w:val="18"/>
+                <w:szCs w:val="18"/>
+              </w:rPr>
+              <w:t>{{</w:t>
+            </w:r>
+            <w:proofErr w:type="spellStart"/>
+            <w:r>
+              <w:rPr>
+                <w:color w:val="11437E"/>
+                <w:sz w:val="18"/>
+                <w:szCs w:val="18"/>
+              </w:rPr>
+              <w:t>photos</w:t>
+            </w:r>
+            <w:proofErr w:type="spellEnd"/>
+            <w:r>
+              <w:rPr>
+                <w:color w:val="11437E"/>
+                <w:sz w:val="18"/>
+                <w:szCs w:val="18"/>
+              </w:rPr>
+              <w:t>}}</w:t>
             </w:r>
           </w:p>
         </w:tc>
@@ -1984,6 +2591,7 @@
               <w:spacing w:line="144" w:lineRule="auto"/>
             </w:pPr>
             <w:r>
+              <w:lastRenderedPageBreak/>
               <w:t>_________________</w:t>
             </w:r>
           </w:p>
@@ -2018,7 +2626,21 @@
               <w:rPr>
                 <w:color w:val="11437E"/>
               </w:rPr>
-              <w:t>{{leadername}}</w:t>
+              <w:t>{{</w:t>
+            </w:r>
+            <w:proofErr w:type="spellStart"/>
+            <w:r>
+              <w:rPr>
+                <w:color w:val="11437E"/>
+              </w:rPr>
+              <w:t>leadername</w:t>
+            </w:r>
+            <w:proofErr w:type="spellEnd"/>
+            <w:r>
+              <w:rPr>
+                <w:color w:val="11437E"/>
+              </w:rPr>
+              <w:t>}}</w:t>
             </w:r>
           </w:p>
           <w:p>
@@ -2040,7 +2662,21 @@
               <w:rPr>
                 <w:color w:val="11437E"/>
               </w:rPr>
-              <w:t>{{leaderposition}}</w:t>
+              <w:t>{{</w:t>
+            </w:r>
+            <w:proofErr w:type="spellStart"/>
+            <w:r>
+              <w:rPr>
+                <w:color w:val="11437E"/>
+              </w:rPr>
+              <w:t>leaderposition</w:t>
+            </w:r>
+            <w:proofErr w:type="spellEnd"/>
+            <w:r>
+              <w:rPr>
+                <w:color w:val="11437E"/>
+              </w:rPr>
+              <w:t>}}</w:t>
             </w:r>
           </w:p>
         </w:tc>
@@ -2175,6 +2811,7 @@
                 <w:b/>
                 <w:bCs/>
               </w:rPr>
+              <w:lastRenderedPageBreak/>
               <w:t>Cliente:</w:t>
             </w:r>
             <w:r>
@@ -2512,12 +3149,8 @@
       </w:pPr>
     </w:p>
     <w:sectPr>
-      <w:headerReference w:type="even" r:id="rId6"/>
-      <w:headerReference w:type="default" r:id="rId7"/>
-      <w:footerReference w:type="even" r:id="rId8"/>
-      <w:footerReference w:type="default" r:id="rId9"/>
-      <w:headerReference w:type="first" r:id="rId10"/>
-      <w:footerReference w:type="first" r:id="rId11"/>
+      <w:headerReference w:type="default" r:id="rId6"/>
+      <w:footerReference w:type="default" r:id="rId7"/>
       <w:pgSz w:w="11909" w:h="16834"/>
       <w:pgMar w:top="1440" w:right="1440" w:bottom="1440" w:left="1440" w:header="720" w:footer="453" w:gutter="0"/>
       <w:pgNumType w:start="1"/>
@@ -2553,16 +3186,6 @@
 </file>
 
 <file path=word/footer1.xml><?xml version="1.0" encoding="utf-8"?>
-<w:ftr xmlns:wpc="http://schemas.microsoft.com/office/word/2010/wordprocessingCanvas" xmlns:cx="http://schemas.microsoft.com/office/drawing/2014/chartex" xmlns:cx1="http://schemas.microsoft.com/office/drawing/2015/9/8/chartex" xmlns:cx2="http://schemas.microsoft.com/office/drawing/2015/10/21/chartex" xmlns:cx3="http://schemas.microsoft.com/office/drawing/2016/5/9/chartex" xmlns:cx4="http://schemas.microsoft.com/office/drawing/2016/5/10/chartex" xmlns:cx5="http://schemas.microsoft.com/office/drawing/2016/5/11/chartex" xmlns:cx6="http://schemas.microsoft.com/office/drawing/2016/5/12/chartex" xmlns:cx7="http://schemas.microsoft.com/office/drawing/2016/5/13/chartex" xmlns:cx8="http://schemas.microsoft.com/office/drawing/2016/5/14/chartex" xmlns:mc="http://schemas.openxmlformats.org/markup-compatibility/2006" xmlns:aink="http://schemas.microsoft.com/office/drawing/2016/ink" xmlns:am3d="http://schemas.microsoft.com/office/drawing/2017/model3d" xmlns:o="urn:schemas-microsoft-com:office:office" xmlns:oel="http://schemas.microsoft.com/office/2019/extlst" xmlns:r="http://schemas.openxmlformats.org/officeDocument/2006/relationships" xmlns:m="http://schemas.openxmlformats.org/officeDocument/2006/math" xmlns:v="urn:schemas-microsoft-com:vml" xmlns:wp14="http://schemas.microsoft.com/office/word/2010/wordprocessingDrawing" xmlns:wp="http://schemas.openxmlformats.org/drawingml/2006/wordprocessingDrawing" xmlns:w10="urn:schemas-microsoft-com:office:word" xmlns:w="http://schemas.openxmlformats.org/wordprocessingml/2006/main" xmlns:w14="http://schemas.microsoft.com/office/word/2010/wordml" xmlns:w15="http://schemas.microsoft.com/office/word/2012/wordml" xmlns:w16cex="http://schemas.microsoft.com/office/word/2018/wordml/cex" xmlns:w16cid="http://schemas.microsoft.com/office/word/2016/wordml/cid" xmlns:w16="http://schemas.microsoft.com/office/word/2018/wordml" xmlns:w16du="http://schemas.microsoft.com/office/word/2023/wordml/word16du" xmlns:w16sdtdh="http://schemas.microsoft.com/office/word/2020/wordml/sdtdatahash" xmlns:w16sdtfl="http://schemas.microsoft.com/office/word/2024/wordml/sdtformatlock" xmlns:w16se="http://schemas.microsoft.com/office/word/2015/wordml/symex" xmlns:wpg="http://schemas.microsoft.com/office/word/2010/wordprocessingGroup" xmlns:wpi="http://schemas.microsoft.com/office/word/2010/wordprocessingInk" xmlns:wne="http://schemas.microsoft.com/office/word/2006/wordml" xmlns:wps="http://schemas.microsoft.com/office/word/2010/wordprocessingShape" mc:Ignorable="w14 w15 w16se w16cid w16 w16cex w16sdtdh w16sdtfl w16du wp14">
-  <w:p>
-    <w:pPr>
-      <w:pStyle w:val="Rodap"/>
-    </w:pPr>
-  </w:p>
-</w:ftr>
-</file>
-
-<file path=word/footer2.xml><?xml version="1.0" encoding="utf-8"?>
 <w:ftr xmlns:wpc="http://schemas.microsoft.com/office/word/2010/wordprocessingCanvas" xmlns:cx="http://schemas.microsoft.com/office/drawing/2014/chartex" xmlns:cx1="http://schemas.microsoft.com/office/drawing/2015/9/8/chartex" xmlns:cx2="http://schemas.microsoft.com/office/drawing/2015/10/21/chartex" xmlns:cx3="http://schemas.microsoft.com/office/drawing/2016/5/9/chartex" xmlns:cx4="http://schemas.microsoft.com/office/drawing/2016/5/10/chartex" xmlns:cx5="http://schemas.microsoft.com/office/drawing/2016/5/11/chartex" xmlns:cx6="http://schemas.microsoft.com/office/drawing/2016/5/12/chartex" xmlns:cx7="http://schemas.microsoft.com/office/drawing/2016/5/13/chartex" xmlns:cx8="http://schemas.microsoft.com/office/drawing/2016/5/14/chartex" xmlns:mc="http://schemas.openxmlformats.org/markup-compatibility/2006" xmlns:aink="http://schemas.microsoft.com/office/drawing/2016/ink" xmlns:am3d="http://schemas.microsoft.com/office/drawing/2017/model3d" xmlns:o="urn:schemas-microsoft-com:office:office" xmlns:oel="http://schemas.microsoft.com/office/2019/extlst" xmlns:r="http://schemas.openxmlformats.org/officeDocument/2006/relationships" xmlns:m="http://schemas.openxmlformats.org/officeDocument/2006/math" xmlns:v="urn:schemas-microsoft-com:vml" xmlns:wp14="http://schemas.microsoft.com/office/word/2010/wordprocessingDrawing" xmlns:wp="http://schemas.openxmlformats.org/drawingml/2006/wordprocessingDrawing" xmlns:w10="urn:schemas-microsoft-com:office:word" xmlns:w="http://schemas.openxmlformats.org/wordprocessingml/2006/main" xmlns:w14="http://schemas.microsoft.com/office/word/2010/wordml" xmlns:w15="http://schemas.microsoft.com/office/word/2012/wordml" xmlns:w16cex="http://schemas.microsoft.com/office/word/2018/wordml/cex" xmlns:w16cid="http://schemas.microsoft.com/office/word/2016/wordml/cid" xmlns:w16="http://schemas.microsoft.com/office/word/2018/wordml" xmlns:w16du="http://schemas.microsoft.com/office/word/2023/wordml/word16du" xmlns:w16sdtdh="http://schemas.microsoft.com/office/word/2020/wordml/sdtdatahash" xmlns:w16sdtfl="http://schemas.microsoft.com/office/word/2024/wordml/sdtformatlock" xmlns:w16se="http://schemas.microsoft.com/office/word/2015/wordml/symex" xmlns:wpg="http://schemas.microsoft.com/office/word/2010/wordprocessingGroup" xmlns:wpi="http://schemas.microsoft.com/office/word/2010/wordprocessingInk" xmlns:wne="http://schemas.microsoft.com/office/word/2006/wordml" xmlns:wps="http://schemas.microsoft.com/office/word/2010/wordprocessingShape" mc:Ignorable="w14 w15 w16se w16cid w16 w16cex w16sdtdh w16sdtfl w16du wp14">
   <w:p>
     <w:pPr>
@@ -2709,16 +3332,6 @@
 </w:ftr>
 </file>
 
-<file path=word/footer3.xml><?xml version="1.0" encoding="utf-8"?>
-<w:ftr xmlns:wpc="http://schemas.microsoft.com/office/word/2010/wordprocessingCanvas" xmlns:cx="http://schemas.microsoft.com/office/drawing/2014/chartex" xmlns:cx1="http://schemas.microsoft.com/office/drawing/2015/9/8/chartex" xmlns:cx2="http://schemas.microsoft.com/office/drawing/2015/10/21/chartex" xmlns:cx3="http://schemas.microsoft.com/office/drawing/2016/5/9/chartex" xmlns:cx4="http://schemas.microsoft.com/office/drawing/2016/5/10/chartex" xmlns:cx5="http://schemas.microsoft.com/office/drawing/2016/5/11/chartex" xmlns:cx6="http://schemas.microsoft.com/office/drawing/2016/5/12/chartex" xmlns:cx7="http://schemas.microsoft.com/office/drawing/2016/5/13/chartex" xmlns:cx8="http://schemas.microsoft.com/office/drawing/2016/5/14/chartex" xmlns:mc="http://schemas.openxmlformats.org/markup-compatibility/2006" xmlns:aink="http://schemas.microsoft.com/office/drawing/2016/ink" xmlns:am3d="http://schemas.microsoft.com/office/drawing/2017/model3d" xmlns:o="urn:schemas-microsoft-com:office:office" xmlns:oel="http://schemas.microsoft.com/office/2019/extlst" xmlns:r="http://schemas.openxmlformats.org/officeDocument/2006/relationships" xmlns:m="http://schemas.openxmlformats.org/officeDocument/2006/math" xmlns:v="urn:schemas-microsoft-com:vml" xmlns:wp14="http://schemas.microsoft.com/office/word/2010/wordprocessingDrawing" xmlns:wp="http://schemas.openxmlformats.org/drawingml/2006/wordprocessingDrawing" xmlns:w10="urn:schemas-microsoft-com:office:word" xmlns:w="http://schemas.openxmlformats.org/wordprocessingml/2006/main" xmlns:w14="http://schemas.microsoft.com/office/word/2010/wordml" xmlns:w15="http://schemas.microsoft.com/office/word/2012/wordml" xmlns:w16cex="http://schemas.microsoft.com/office/word/2018/wordml/cex" xmlns:w16cid="http://schemas.microsoft.com/office/word/2016/wordml/cid" xmlns:w16="http://schemas.microsoft.com/office/word/2018/wordml" xmlns:w16du="http://schemas.microsoft.com/office/word/2023/wordml/word16du" xmlns:w16sdtdh="http://schemas.microsoft.com/office/word/2020/wordml/sdtdatahash" xmlns:w16sdtfl="http://schemas.microsoft.com/office/word/2024/wordml/sdtformatlock" xmlns:w16se="http://schemas.microsoft.com/office/word/2015/wordml/symex" xmlns:wpg="http://schemas.microsoft.com/office/word/2010/wordprocessingGroup" xmlns:wpi="http://schemas.microsoft.com/office/word/2010/wordprocessingInk" xmlns:wne="http://schemas.microsoft.com/office/word/2006/wordml" xmlns:wps="http://schemas.microsoft.com/office/word/2010/wordprocessingShape" mc:Ignorable="w14 w15 w16se w16cid w16 w16cex w16sdtdh w16sdtfl w16du wp14">
-  <w:p>
-    <w:pPr>
-      <w:pStyle w:val="Rodap"/>
-    </w:pPr>
-  </w:p>
-</w:ftr>
-</file>
-
 <file path=word/footnotes.xml><?xml version="1.0" encoding="utf-8"?>
 <w:footnotes xmlns:wpc="http://schemas.microsoft.com/office/word/2010/wordprocessingCanvas" xmlns:cx="http://schemas.microsoft.com/office/drawing/2014/chartex" xmlns:cx1="http://schemas.microsoft.com/office/drawing/2015/9/8/chartex" xmlns:cx2="http://schemas.microsoft.com/office/drawing/2015/10/21/chartex" xmlns:cx3="http://schemas.microsoft.com/office/drawing/2016/5/9/chartex" xmlns:cx4="http://schemas.microsoft.com/office/drawing/2016/5/10/chartex" xmlns:cx5="http://schemas.microsoft.com/office/drawing/2016/5/11/chartex" xmlns:cx6="http://schemas.microsoft.com/office/drawing/2016/5/12/chartex" xmlns:cx7="http://schemas.microsoft.com/office/drawing/2016/5/13/chartex" xmlns:cx8="http://schemas.microsoft.com/office/drawing/2016/5/14/chartex" xmlns:mc="http://schemas.openxmlformats.org/markup-compatibility/2006" xmlns:aink="http://schemas.microsoft.com/office/drawing/2016/ink" xmlns:am3d="http://schemas.microsoft.com/office/drawing/2017/model3d" xmlns:o="urn:schemas-microsoft-com:office:office" xmlns:oel="http://schemas.microsoft.com/office/2019/extlst" xmlns:r="http://schemas.openxmlformats.org/officeDocument/2006/relationships" xmlns:m="http://schemas.openxmlformats.org/officeDocument/2006/math" xmlns:v="urn:schemas-microsoft-com:vml" xmlns:wp14="http://schemas.microsoft.com/office/word/2010/wordprocessingDrawing" xmlns:wp="http://schemas.openxmlformats.org/drawingml/2006/wordprocessingDrawing" xmlns:w10="urn:schemas-microsoft-com:office:word" xmlns:w="http://schemas.openxmlformats.org/wordprocessingml/2006/main" xmlns:w14="http://schemas.microsoft.com/office/word/2010/wordml" xmlns:w15="http://schemas.microsoft.com/office/word/2012/wordml" xmlns:w16cex="http://schemas.microsoft.com/office/word/2018/wordml/cex" xmlns:w16cid="http://schemas.microsoft.com/office/word/2016/wordml/cid" xmlns:w16="http://schemas.microsoft.com/office/word/2018/wordml" xmlns:w16du="http://schemas.microsoft.com/office/word/2023/wordml/word16du" xmlns:w16sdtdh="http://schemas.microsoft.com/office/word/2020/wordml/sdtdatahash" xmlns:w16sdtfl="http://schemas.microsoft.com/office/word/2024/wordml/sdtformatlock" xmlns:w16se="http://schemas.microsoft.com/office/word/2015/wordml/symex" xmlns:wpg="http://schemas.microsoft.com/office/word/2010/wordprocessingGroup" xmlns:wpi="http://schemas.microsoft.com/office/word/2010/wordprocessingInk" xmlns:wne="http://schemas.microsoft.com/office/word/2006/wordml" xmlns:wps="http://schemas.microsoft.com/office/word/2010/wordprocessingShape" mc:Ignorable="w14 w15 w16se w16cid w16 w16cex w16sdtdh w16sdtfl w16du wp14">
   <w:footnote w:type="separator" w:id="-1">
@@ -2745,16 +3358,6 @@
 </file>
 
 <file path=word/header1.xml><?xml version="1.0" encoding="utf-8"?>
-<w:hdr xmlns:wpc="http://schemas.microsoft.com/office/word/2010/wordprocessingCanvas" xmlns:cx="http://schemas.microsoft.com/office/drawing/2014/chartex" xmlns:cx1="http://schemas.microsoft.com/office/drawing/2015/9/8/chartex" xmlns:cx2="http://schemas.microsoft.com/office/drawing/2015/10/21/chartex" xmlns:cx3="http://schemas.microsoft.com/office/drawing/2016/5/9/chartex" xmlns:cx4="http://schemas.microsoft.com/office/drawing/2016/5/10/chartex" xmlns:cx5="http://schemas.microsoft.com/office/drawing/2016/5/11/chartex" xmlns:cx6="http://schemas.microsoft.com/office/drawing/2016/5/12/chartex" xmlns:cx7="http://schemas.microsoft.com/office/drawing/2016/5/13/chartex" xmlns:cx8="http://schemas.microsoft.com/office/drawing/2016/5/14/chartex" xmlns:mc="http://schemas.openxmlformats.org/markup-compatibility/2006" xmlns:aink="http://schemas.microsoft.com/office/drawing/2016/ink" xmlns:am3d="http://schemas.microsoft.com/office/drawing/2017/model3d" xmlns:o="urn:schemas-microsoft-com:office:office" xmlns:oel="http://schemas.microsoft.com/office/2019/extlst" xmlns:r="http://schemas.openxmlformats.org/officeDocument/2006/relationships" xmlns:m="http://schemas.openxmlformats.org/officeDocument/2006/math" xmlns:v="urn:schemas-microsoft-com:vml" xmlns:wp14="http://schemas.microsoft.com/office/word/2010/wordprocessingDrawing" xmlns:wp="http://schemas.openxmlformats.org/drawingml/2006/wordprocessingDrawing" xmlns:w10="urn:schemas-microsoft-com:office:word" xmlns:w="http://schemas.openxmlformats.org/wordprocessingml/2006/main" xmlns:w14="http://schemas.microsoft.com/office/word/2010/wordml" xmlns:w15="http://schemas.microsoft.com/office/word/2012/wordml" xmlns:w16cex="http://schemas.microsoft.com/office/word/2018/wordml/cex" xmlns:w16cid="http://schemas.microsoft.com/office/word/2016/wordml/cid" xmlns:w16="http://schemas.microsoft.com/office/word/2018/wordml" xmlns:w16du="http://schemas.microsoft.com/office/word/2023/wordml/word16du" xmlns:w16sdtdh="http://schemas.microsoft.com/office/word/2020/wordml/sdtdatahash" xmlns:w16sdtfl="http://schemas.microsoft.com/office/word/2024/wordml/sdtformatlock" xmlns:w16se="http://schemas.microsoft.com/office/word/2015/wordml/symex" xmlns:wpg="http://schemas.microsoft.com/office/word/2010/wordprocessingGroup" xmlns:wpi="http://schemas.microsoft.com/office/word/2010/wordprocessingInk" xmlns:wne="http://schemas.microsoft.com/office/word/2006/wordml" xmlns:wps="http://schemas.microsoft.com/office/word/2010/wordprocessingShape" mc:Ignorable="w14 w15 w16se w16cid w16 w16cex w16sdtdh w16sdtfl w16du wp14">
-  <w:p>
-    <w:pPr>
-      <w:pStyle w:val="Cabealho"/>
-    </w:pPr>
-  </w:p>
-</w:hdr>
-</file>
-
-<file path=word/header2.xml><?xml version="1.0" encoding="utf-8"?>
 <w:hdr xmlns:wpc="http://schemas.microsoft.com/office/word/2010/wordprocessingCanvas" xmlns:cx="http://schemas.microsoft.com/office/drawing/2014/chartex" xmlns:cx1="http://schemas.microsoft.com/office/drawing/2015/9/8/chartex" xmlns:cx2="http://schemas.microsoft.com/office/drawing/2015/10/21/chartex" xmlns:cx3="http://schemas.microsoft.com/office/drawing/2016/5/9/chartex" xmlns:cx4="http://schemas.microsoft.com/office/drawing/2016/5/10/chartex" xmlns:cx5="http://schemas.microsoft.com/office/drawing/2016/5/11/chartex" xmlns:cx6="http://schemas.microsoft.com/office/drawing/2016/5/12/chartex" xmlns:cx7="http://schemas.microsoft.com/office/drawing/2016/5/13/chartex" xmlns:cx8="http://schemas.microsoft.com/office/drawing/2016/5/14/chartex" xmlns:mc="http://schemas.openxmlformats.org/markup-compatibility/2006" xmlns:aink="http://schemas.microsoft.com/office/drawing/2016/ink" xmlns:am3d="http://schemas.microsoft.com/office/drawing/2017/model3d" xmlns:o="urn:schemas-microsoft-com:office:office" xmlns:oel="http://schemas.microsoft.com/office/2019/extlst" xmlns:r="http://schemas.openxmlformats.org/officeDocument/2006/relationships" xmlns:m="http://schemas.openxmlformats.org/officeDocument/2006/math" xmlns:v="urn:schemas-microsoft-com:vml" xmlns:wp14="http://schemas.microsoft.com/office/word/2010/wordprocessingDrawing" xmlns:wp="http://schemas.openxmlformats.org/drawingml/2006/wordprocessingDrawing" xmlns:w10="urn:schemas-microsoft-com:office:word" xmlns:w="http://schemas.openxmlformats.org/wordprocessingml/2006/main" xmlns:w14="http://schemas.microsoft.com/office/word/2010/wordml" xmlns:w15="http://schemas.microsoft.com/office/word/2012/wordml" xmlns:w16cex="http://schemas.microsoft.com/office/word/2018/wordml/cex" xmlns:w16cid="http://schemas.microsoft.com/office/word/2016/wordml/cid" xmlns:w16="http://schemas.microsoft.com/office/word/2018/wordml" xmlns:w16du="http://schemas.microsoft.com/office/word/2023/wordml/word16du" xmlns:w16sdtdh="http://schemas.microsoft.com/office/word/2020/wordml/sdtdatahash" xmlns:w16sdtfl="http://schemas.microsoft.com/office/word/2024/wordml/sdtformatlock" xmlns:w16se="http://schemas.microsoft.com/office/word/2015/wordml/symex" xmlns:wpg="http://schemas.microsoft.com/office/word/2010/wordprocessingGroup" xmlns:wpi="http://schemas.microsoft.com/office/word/2010/wordprocessingInk" xmlns:wne="http://schemas.microsoft.com/office/word/2006/wordml" xmlns:wps="http://schemas.microsoft.com/office/word/2010/wordprocessingShape" mc:Ignorable="w14 w15 w16se w16cid w16 w16cex w16sdtdh w16sdtfl w16du wp14">
   <w:p>
     <w:pPr>
@@ -3059,7 +3662,29 @@
               <w:sz w:val="18"/>
               <w:szCs w:val="18"/>
             </w:rPr>
-            <w:t>{{missiontitle}}</w:t>
+            <w:t>{{</w:t>
+          </w:r>
+          <w:proofErr w:type="spellStart"/>
+          <w:r>
+            <w:rPr>
+              <w:b/>
+              <w:bCs/>
+              <w:color w:val="E8E8E8"/>
+              <w:sz w:val="18"/>
+              <w:szCs w:val="18"/>
+            </w:rPr>
+            <w:t>missiontitle</w:t>
+          </w:r>
+          <w:proofErr w:type="spellEnd"/>
+          <w:r>
+            <w:rPr>
+              <w:b/>
+              <w:bCs/>
+              <w:color w:val="E8E8E8"/>
+              <w:sz w:val="18"/>
+              <w:szCs w:val="18"/>
+            </w:rPr>
+            <w:t>}}</w:t>
           </w:r>
         </w:p>
       </w:tc>
@@ -3102,7 +3727,29 @@
               <w:sz w:val="18"/>
               <w:szCs w:val="18"/>
             </w:rPr>
-            <w:t>{{client}}</w:t>
+            <w:t>{{</w:t>
+          </w:r>
+          <w:proofErr w:type="spellStart"/>
+          <w:r>
+            <w:rPr>
+              <w:b/>
+              <w:bCs/>
+              <w:color w:val="11437E"/>
+              <w:sz w:val="18"/>
+              <w:szCs w:val="18"/>
+            </w:rPr>
+            <w:t>client</w:t>
+          </w:r>
+          <w:proofErr w:type="spellEnd"/>
+          <w:r>
+            <w:rPr>
+              <w:b/>
+              <w:bCs/>
+              <w:color w:val="11437E"/>
+              <w:sz w:val="18"/>
+              <w:szCs w:val="18"/>
+            </w:rPr>
+            <w:t>}}</w:t>
           </w:r>
         </w:p>
       </w:tc>
@@ -3140,7 +3787,29 @@
               <w:sz w:val="18"/>
               <w:szCs w:val="18"/>
             </w:rPr>
-            <w:t>{{proposal}}</w:t>
+            <w:t>{{</w:t>
+          </w:r>
+          <w:proofErr w:type="spellStart"/>
+          <w:r>
+            <w:rPr>
+              <w:b/>
+              <w:bCs/>
+              <w:color w:val="11437E"/>
+              <w:sz w:val="18"/>
+              <w:szCs w:val="18"/>
+            </w:rPr>
+            <w:t>proposal</w:t>
+          </w:r>
+          <w:proofErr w:type="spellEnd"/>
+          <w:r>
+            <w:rPr>
+              <w:b/>
+              <w:bCs/>
+              <w:color w:val="11437E"/>
+              <w:sz w:val="18"/>
+              <w:szCs w:val="18"/>
+            </w:rPr>
+            <w:t>}}</w:t>
           </w:r>
         </w:p>
       </w:tc>
@@ -3187,7 +3856,29 @@
               <w:sz w:val="18"/>
               <w:szCs w:val="18"/>
             </w:rPr>
-            <w:t>{{rdo}}</w:t>
+            <w:t>{{</w:t>
+          </w:r>
+          <w:proofErr w:type="spellStart"/>
+          <w:r>
+            <w:rPr>
+              <w:b/>
+              <w:bCs/>
+              <w:color w:val="11437E"/>
+              <w:sz w:val="18"/>
+              <w:szCs w:val="18"/>
+            </w:rPr>
+            <w:t>rdo</w:t>
+          </w:r>
+          <w:proofErr w:type="spellEnd"/>
+          <w:r>
+            <w:rPr>
+              <w:b/>
+              <w:bCs/>
+              <w:color w:val="11437E"/>
+              <w:sz w:val="18"/>
+              <w:szCs w:val="18"/>
+            </w:rPr>
+            <w:t>}}</w:t>
           </w:r>
         </w:p>
       </w:tc>
@@ -3230,7 +3921,29 @@
               <w:sz w:val="18"/>
               <w:szCs w:val="18"/>
             </w:rPr>
-            <w:t xml:space="preserve"> {{cnpj}}</w:t>
+            <w:t xml:space="preserve"> {{</w:t>
+          </w:r>
+          <w:proofErr w:type="spellStart"/>
+          <w:r>
+            <w:rPr>
+              <w:b/>
+              <w:bCs/>
+              <w:color w:val="11437E"/>
+              <w:sz w:val="18"/>
+              <w:szCs w:val="18"/>
+            </w:rPr>
+            <w:t>cnpj</w:t>
+          </w:r>
+          <w:proofErr w:type="spellEnd"/>
+          <w:r>
+            <w:rPr>
+              <w:b/>
+              <w:bCs/>
+              <w:color w:val="11437E"/>
+              <w:sz w:val="18"/>
+              <w:szCs w:val="18"/>
+            </w:rPr>
+            <w:t>}}</w:t>
           </w:r>
         </w:p>
       </w:tc>
@@ -3338,16 +4051,6 @@
         <v:rect id="_x0000_i1025" style="width:0;height:1.5pt" o:hralign="center" o:hrstd="t" o:hr="t" fillcolor="#a0a0a0" stroked="f"/>
       </w:pict>
     </w:r>
-  </w:p>
-</w:hdr>
-</file>
-
-<file path=word/header3.xml><?xml version="1.0" encoding="utf-8"?>
-<w:hdr xmlns:wpc="http://schemas.microsoft.com/office/word/2010/wordprocessingCanvas" xmlns:cx="http://schemas.microsoft.com/office/drawing/2014/chartex" xmlns:cx1="http://schemas.microsoft.com/office/drawing/2015/9/8/chartex" xmlns:cx2="http://schemas.microsoft.com/office/drawing/2015/10/21/chartex" xmlns:cx3="http://schemas.microsoft.com/office/drawing/2016/5/9/chartex" xmlns:cx4="http://schemas.microsoft.com/office/drawing/2016/5/10/chartex" xmlns:cx5="http://schemas.microsoft.com/office/drawing/2016/5/11/chartex" xmlns:cx6="http://schemas.microsoft.com/office/drawing/2016/5/12/chartex" xmlns:cx7="http://schemas.microsoft.com/office/drawing/2016/5/13/chartex" xmlns:cx8="http://schemas.microsoft.com/office/drawing/2016/5/14/chartex" xmlns:mc="http://schemas.openxmlformats.org/markup-compatibility/2006" xmlns:aink="http://schemas.microsoft.com/office/drawing/2016/ink" xmlns:am3d="http://schemas.microsoft.com/office/drawing/2017/model3d" xmlns:o="urn:schemas-microsoft-com:office:office" xmlns:oel="http://schemas.microsoft.com/office/2019/extlst" xmlns:r="http://schemas.openxmlformats.org/officeDocument/2006/relationships" xmlns:m="http://schemas.openxmlformats.org/officeDocument/2006/math" xmlns:v="urn:schemas-microsoft-com:vml" xmlns:wp14="http://schemas.microsoft.com/office/word/2010/wordprocessingDrawing" xmlns:wp="http://schemas.openxmlformats.org/drawingml/2006/wordprocessingDrawing" xmlns:w10="urn:schemas-microsoft-com:office:word" xmlns:w="http://schemas.openxmlformats.org/wordprocessingml/2006/main" xmlns:w14="http://schemas.microsoft.com/office/word/2010/wordml" xmlns:w15="http://schemas.microsoft.com/office/word/2012/wordml" xmlns:w16cex="http://schemas.microsoft.com/office/word/2018/wordml/cex" xmlns:w16cid="http://schemas.microsoft.com/office/word/2016/wordml/cid" xmlns:w16="http://schemas.microsoft.com/office/word/2018/wordml" xmlns:w16du="http://schemas.microsoft.com/office/word/2023/wordml/word16du" xmlns:w16sdtdh="http://schemas.microsoft.com/office/word/2020/wordml/sdtdatahash" xmlns:w16sdtfl="http://schemas.microsoft.com/office/word/2024/wordml/sdtformatlock" xmlns:w16se="http://schemas.microsoft.com/office/word/2015/wordml/symex" xmlns:wpg="http://schemas.microsoft.com/office/word/2010/wordprocessingGroup" xmlns:wpi="http://schemas.microsoft.com/office/word/2010/wordprocessingInk" xmlns:wne="http://schemas.microsoft.com/office/word/2006/wordml" xmlns:wps="http://schemas.microsoft.com/office/word/2010/wordprocessingShape" mc:Ignorable="w14 w15 w16se w16cid w16 w16cex w16sdtdh w16sdtfl w16du wp14">
-  <w:p>
-    <w:pPr>
-      <w:pStyle w:val="Cabealho"/>
-    </w:pPr>
   </w:p>
 </w:hdr>
 </file>
@@ -3750,6 +4453,7 @@
   <w:style w:type="paragraph" w:default="1" w:styleId="Normal">
     <w:name w:val="Normal"/>
     <w:qFormat/>
+    <w:rsid w:val="00787BF7"/>
   </w:style>
   <w:style w:type="paragraph" w:styleId="Ttulo1">
     <w:name w:val="heading 1"/>

</xml_diff>

<commit_message>
add: unidade de medida para diametros; multiplas unidades de serviço permitidas, menu retrátil nos paineis
</commit_message>
<xml_diff>
--- a/Modelos/definitivos/Modelo definitivo.docx
+++ b/Modelos/definitivos/Modelo definitivo.docx
@@ -12,6 +12,7 @@
           <w:color w:val="30503A"/>
           <w:sz w:val="28"/>
           <w:szCs w:val="28"/>
+          <w:u w:val="single"/>
         </w:rPr>
       </w:pPr>
     </w:p>
@@ -901,16 +902,14 @@
                 <w:color w:val="11437E"/>
                 <w:sz w:val="18"/>
                 <w:szCs w:val="18"/>
-                <w:u w:val="single"/>
-              </w:rPr>
-            </w:pPr>
-            <w:r>
-              <w:rPr>
-                <w:b/>
-                <w:bCs/>
-                <w:sz w:val="18"/>
-                <w:szCs w:val="18"/>
-                <w:u w:val="single"/>
+              </w:rPr>
+            </w:pPr>
+            <w:r>
+              <w:rPr>
+                <w:b/>
+                <w:bCs/>
+                <w:sz w:val="18"/>
+                <w:szCs w:val="18"/>
               </w:rPr>
               <w:t xml:space="preserve">Comentário: </w:t>
             </w:r>
@@ -919,7 +918,6 @@
                 <w:color w:val="11437E"/>
                 <w:sz w:val="18"/>
                 <w:szCs w:val="18"/>
-                <w:u w:val="single"/>
               </w:rPr>
               <w:t>{{</w:t>
             </w:r>
@@ -929,7 +927,6 @@
                 <w:color w:val="11437E"/>
                 <w:sz w:val="18"/>
                 <w:szCs w:val="18"/>
-                <w:u w:val="single"/>
               </w:rPr>
               <w:t>overtimecomment</w:t>
             </w:r>
@@ -939,7 +936,6 @@
                 <w:color w:val="11437E"/>
                 <w:sz w:val="18"/>
                 <w:szCs w:val="18"/>
-                <w:u w:val="single"/>
               </w:rPr>
               <w:t>}}</w:t>
             </w:r>
@@ -1461,7 +1457,6 @@
         <w:rPr>
           <w:b/>
           <w:bCs/>
-          <w:color w:val="30503A"/>
           <w:sz w:val="18"/>
           <w:szCs w:val="18"/>
         </w:rPr>
@@ -2438,7 +2433,6 @@
                 <w:color w:val="11437E"/>
                 <w:sz w:val="18"/>
                 <w:szCs w:val="18"/>
-                <w:u w:val="single"/>
               </w:rPr>
             </w:pPr>
             <w:r>
@@ -2471,25 +2465,6 @@
         </w:tc>
       </w:tr>
     </w:tbl>
-    <w:p>
-      <w:pPr>
-        <w:widowControl w:val="0"/>
-        <w:pBdr>
-          <w:top w:val="nil"/>
-          <w:left w:val="nil"/>
-          <w:bottom w:val="nil"/>
-          <w:right w:val="nil"/>
-          <w:between w:val="nil"/>
-        </w:pBdr>
-        <w:rPr>
-          <w:b/>
-          <w:bCs/>
-          <w:color w:val="30503A"/>
-          <w:sz w:val="28"/>
-          <w:szCs w:val="28"/>
-        </w:rPr>
-      </w:pPr>
-    </w:p>
     <w:p>
       <w:pPr>
         <w:widowControl w:val="0"/>
@@ -2515,14 +2490,6 @@
         <w:tblW w:w="10335" w:type="dxa"/>
         <w:jc w:val="center"/>
         <w:tblInd w:w="0" w:type="dxa"/>
-        <w:tblBorders>
-          <w:top w:val="single" w:sz="8" w:space="0" w:color="FFFFFF"/>
-          <w:left w:val="single" w:sz="8" w:space="0" w:color="FFFFFF"/>
-          <w:bottom w:val="single" w:sz="8" w:space="0" w:color="FFFFFF"/>
-          <w:right w:val="single" w:sz="8" w:space="0" w:color="FFFFFF"/>
-          <w:insideH w:val="single" w:sz="8" w:space="0" w:color="FFFFFF"/>
-          <w:insideV w:val="single" w:sz="8" w:space="0" w:color="FFFFFF"/>
-        </w:tblBorders>
         <w:tblLayout w:type="fixed"/>
         <w:tblLook w:val="0600" w:firstRow="0" w:lastRow="0" w:firstColumn="0" w:lastColumn="0" w:noHBand="1" w:noVBand="1"/>
       </w:tblPr>
@@ -2534,13 +2501,12 @@
       <w:tr>
         <w:trPr>
           <w:cantSplit/>
-          <w:trHeight w:val="838"/>
+          <w:trHeight w:val="1092"/>
           <w:jc w:val="center"/>
         </w:trPr>
         <w:tc>
           <w:tcPr>
             <w:tcW w:w="4320" w:type="dxa"/>
-            <w:vMerge w:val="restart"/>
             <w:tcMar>
               <w:top w:w="100" w:type="dxa"/>
               <w:left w:w="100" w:type="dxa"/>
@@ -2575,36 +2541,31 @@
             <w:pPr>
               <w:widowControl w:val="0"/>
               <w:spacing w:line="240" w:lineRule="auto"/>
-            </w:pPr>
-            <w:r>
               <w:rPr>
                 <w:b/>
                 <w:bCs/>
                 <w:noProof/>
               </w:rPr>
+            </w:pPr>
+            <w:r>
+              <w:rPr>
+                <w:b/>
+                <w:bCs/>
+                <w:noProof/>
+              </w:rPr>
               <w:t>{{sign}}</w:t>
             </w:r>
           </w:p>
           <w:p>
             <w:pPr>
               <w:widowControl w:val="0"/>
-              <w:spacing w:line="144" w:lineRule="auto"/>
-            </w:pPr>
-            <w:r>
-              <w:lastRenderedPageBreak/>
-              <w:t>_________________</w:t>
-            </w:r>
-          </w:p>
-          <w:p>
-            <w:pPr>
-              <w:widowControl w:val="0"/>
-              <w:spacing w:line="144" w:lineRule="auto"/>
-            </w:pPr>
-          </w:p>
-          <w:p>
-            <w:pPr>
-              <w:widowControl w:val="0"/>
               <w:spacing w:line="240" w:lineRule="auto"/>
+            </w:pPr>
+          </w:p>
+          <w:p>
+            <w:pPr>
+              <w:widowControl w:val="0"/>
+              <w:spacing w:line="240" w:lineRule="auto"/>
               <w:rPr>
                 <w:color w:val="11437E"/>
               </w:rPr>
@@ -2620,13 +2581,7 @@
               <w:rPr>
                 <w:color w:val="11437E"/>
               </w:rPr>
-              <w:t xml:space="preserve"> </w:t>
-            </w:r>
-            <w:r>
-              <w:rPr>
-                <w:color w:val="11437E"/>
-              </w:rPr>
-              <w:t>{{</w:t>
+              <w:t xml:space="preserve"> {{</w:t>
             </w:r>
             <w:proofErr w:type="spellStart"/>
             <w:r>
@@ -2697,6 +2652,18 @@
               <w:rPr>
                 <w:b/>
                 <w:bCs/>
+                <w:sz w:val="28"/>
+                <w:szCs w:val="28"/>
+              </w:rPr>
+            </w:pPr>
+          </w:p>
+          <w:p>
+            <w:pPr>
+              <w:widowControl w:val="0"/>
+              <w:spacing w:line="240" w:lineRule="auto"/>
+              <w:rPr>
+                <w:b/>
+                <w:bCs/>
               </w:rPr>
             </w:pPr>
           </w:p>
@@ -2704,97 +2671,29 @@
         <w:tc>
           <w:tcPr>
             <w:tcW w:w="4020" w:type="dxa"/>
-            <w:vMerge w:val="restart"/>
             <w:tcMar>
               <w:top w:w="100" w:type="dxa"/>
               <w:left w:w="100" w:type="dxa"/>
               <w:bottom w:w="100" w:type="dxa"/>
               <w:right w:w="100" w:type="dxa"/>
             </w:tcMar>
+            <w:vAlign w:val="bottom"/>
           </w:tcPr>
           <w:p>
             <w:pPr>
               <w:widowControl w:val="0"/>
               <w:spacing w:line="240" w:lineRule="auto"/>
-              <w:jc w:val="center"/>
-            </w:pPr>
-            <w:r>
-              <w:rPr>
-                <w:noProof/>
-              </w:rPr>
-              <mc:AlternateContent>
-                <mc:Choice Requires="wpg">
-                  <w:drawing>
-                    <wp:inline distT="114300" distB="114300" distL="114300" distR="114300" wp14:anchorId="620B2EF2" wp14:editId="6214E7FB">
-                      <wp:extent cx="1638300" cy="400050"/>
-                      <wp:effectExtent l="0" t="0" r="0" b="0"/>
-                      <wp:docPr id="2" name="Agrupar 2"/>
-                      <wp:cNvGraphicFramePr/>
-                      <a:graphic xmlns:a="http://schemas.openxmlformats.org/drawingml/2006/main">
-                        <a:graphicData uri="http://schemas.microsoft.com/office/word/2010/wordprocessingGroup">
-                          <wpg:wgp>
-                            <wpg:cNvGrpSpPr/>
-                            <wpg:grpSpPr>
-                              <a:xfrm>
-                                <a:off x="0" y="0"/>
-                                <a:ext cx="1638300" cy="400050"/>
-                                <a:chOff x="0" y="0"/>
-                                <a:chExt cx="1638300" cy="400050"/>
-                              </a:xfrm>
-                            </wpg:grpSpPr>
-                            <wps:wsp>
-                              <wps:cNvPr id="1068688928" name="Retângulo 1068688928"/>
-                              <wps:cNvSpPr/>
-                              <wps:spPr>
-                                <a:xfrm>
-                                  <a:off x="0" y="0"/>
-                                  <a:ext cx="1638300" cy="400050"/>
-                                </a:xfrm>
-                                <a:prstGeom prst="rect">
-                                  <a:avLst/>
-                                </a:prstGeom>
-                                <a:noFill/>
-                              </wps:spPr>
-                              <wps:bodyPr/>
-                            </wps:wsp>
-                            <wps:wsp>
-                              <wps:cNvPr id="146668500" name="Conector reto 146668500"/>
-                              <wps:cNvCnPr/>
-                              <wps:spPr>
-                                <a:xfrm>
-                                  <a:off x="0" y="400050"/>
-                                  <a:ext cx="1638300" cy="0"/>
-                                </a:xfrm>
-                                <a:prstGeom prst="line">
-                                  <a:avLst/>
-                                </a:prstGeom>
-                                <a:noFill/>
-                                <a:ln w="23812">
-                                  <a:solidFill>
-                                    <a:srgbClr val="000000"/>
-                                  </a:solidFill>
-                                </a:ln>
-                              </wps:spPr>
-                              <wps:bodyPr/>
-                            </wps:wsp>
-                          </wpg:wgp>
-                        </a:graphicData>
-                      </a:graphic>
-                    </wp:inline>
-                  </w:drawing>
-                </mc:Choice>
-                <mc:Fallback xmlns:cr="http://schemas.microsoft.com/office/comments/2020/reactions" xmlns="http://schemas.microsoft.com/office/tasks/2019/documenttasks" xmlns:dgm="http://schemas.openxmlformats.org/drawingml/2006/diagram" xmlns:lc="http://schemas.openxmlformats.org/drawingml/2006/lockedCanvas" xmlns:c="http://schemas.openxmlformats.org/drawingml/2006/chart" xmlns:pic="http://schemas.openxmlformats.org/drawingml/2006/picture" xmlns:a="http://schemas.openxmlformats.org/drawingml/2006/main" xmlns:sl="http://schemas.openxmlformats.org/schemaLibrary/2006/main">
-                  <w:drawing>
-                    <wp:inline>
-                      <wp:extent cx="0" cy="0"/>
-                      <wp:docPr id="0"/>
-                      <a:graphic>
-                        <a:graphicData/>
-                      </a:graphic>
-                    </wp:inline>
-                  </w:drawing>
-                </mc:Fallback>
-              </mc:AlternateContent>
+              <w:rPr>
+                <w:b/>
+                <w:bCs/>
+              </w:rPr>
+            </w:pPr>
+            <w:r>
+              <w:rPr>
+                <w:b/>
+                <w:bCs/>
+              </w:rPr>
+              <w:t>Cliente:</w:t>
             </w:r>
           </w:p>
           <w:p>
@@ -2811,328 +2710,8 @@
                 <w:b/>
                 <w:bCs/>
               </w:rPr>
-              <w:lastRenderedPageBreak/>
-              <w:t>Cliente:</w:t>
-            </w:r>
-            <w:r>
-              <w:rPr>
-                <w:noProof/>
-              </w:rPr>
-              <mc:AlternateContent>
-                <mc:Choice Requires="wpg">
-                  <w:drawing>
-                    <wp:inline distT="114300" distB="114300" distL="114300" distR="114300" wp14:anchorId="571481DE" wp14:editId="48C6FAE3">
-                      <wp:extent cx="1638300" cy="400050"/>
-                      <wp:effectExtent l="0" t="0" r="0" b="0"/>
-                      <wp:docPr id="3" name="Agrupar 3"/>
-                      <wp:cNvGraphicFramePr/>
-                      <a:graphic xmlns:a="http://schemas.openxmlformats.org/drawingml/2006/main">
-                        <a:graphicData uri="http://schemas.microsoft.com/office/word/2010/wordprocessingGroup">
-                          <wpg:wgp>
-                            <wpg:cNvGrpSpPr/>
-                            <wpg:grpSpPr>
-                              <a:xfrm>
-                                <a:off x="0" y="0"/>
-                                <a:ext cx="1638300" cy="400050"/>
-                                <a:chOff x="0" y="0"/>
-                                <a:chExt cx="1638300" cy="400050"/>
-                              </a:xfrm>
-                            </wpg:grpSpPr>
-                            <wps:wsp>
-                              <wps:cNvPr id="2066557250" name="Retângulo 2066557250"/>
-                              <wps:cNvSpPr/>
-                              <wps:spPr>
-                                <a:xfrm>
-                                  <a:off x="0" y="0"/>
-                                  <a:ext cx="1638300" cy="400050"/>
-                                </a:xfrm>
-                                <a:prstGeom prst="rect">
-                                  <a:avLst/>
-                                </a:prstGeom>
-                                <a:noFill/>
-                              </wps:spPr>
-                              <wps:bodyPr/>
-                            </wps:wsp>
-                            <wps:wsp>
-                              <wps:cNvPr id="1114623923" name="Conector reto 1114623923"/>
-                              <wps:cNvCnPr/>
-                              <wps:spPr>
-                                <a:xfrm>
-                                  <a:off x="0" y="400050"/>
-                                  <a:ext cx="1638300" cy="0"/>
-                                </a:xfrm>
-                                <a:prstGeom prst="line">
-                                  <a:avLst/>
-                                </a:prstGeom>
-                                <a:noFill/>
-                                <a:ln w="23812">
-                                  <a:solidFill>
-                                    <a:srgbClr val="000000"/>
-                                  </a:solidFill>
-                                </a:ln>
-                              </wps:spPr>
-                              <wps:bodyPr/>
-                            </wps:wsp>
-                          </wpg:wgp>
-                        </a:graphicData>
-                      </a:graphic>
-                    </wp:inline>
-                  </w:drawing>
-                </mc:Choice>
-                <mc:Fallback xmlns:cr="http://schemas.microsoft.com/office/comments/2020/reactions" xmlns="http://schemas.microsoft.com/office/tasks/2019/documenttasks" xmlns:dgm="http://schemas.openxmlformats.org/drawingml/2006/diagram" xmlns:lc="http://schemas.openxmlformats.org/drawingml/2006/lockedCanvas" xmlns:c="http://schemas.openxmlformats.org/drawingml/2006/chart" xmlns:pic="http://schemas.openxmlformats.org/drawingml/2006/picture" xmlns:a="http://schemas.openxmlformats.org/drawingml/2006/main" xmlns:sl="http://schemas.openxmlformats.org/schemaLibrary/2006/main">
-                  <w:drawing>
-                    <wp:inline>
-                      <wp:extent cx="0" cy="0"/>
-                      <wp:docPr id="0"/>
-                      <a:graphic>
-                        <a:graphicData/>
-                      </a:graphic>
-                    </wp:inline>
-                  </w:drawing>
-                </mc:Fallback>
-              </mc:AlternateContent>
-            </w:r>
-          </w:p>
-          <w:p>
-            <w:pPr>
-              <w:widowControl w:val="0"/>
-              <w:spacing w:line="240" w:lineRule="auto"/>
-            </w:pPr>
-            <w:r>
-              <w:rPr>
-                <w:b/>
-                <w:bCs/>
-              </w:rPr>
               <w:t xml:space="preserve">Cargo: </w:t>
             </w:r>
-            <w:r>
-              <w:rPr>
-                <w:noProof/>
-              </w:rPr>
-              <mc:AlternateContent>
-                <mc:Choice Requires="wpg">
-                  <w:drawing>
-                    <wp:inline distT="114300" distB="114300" distL="114300" distR="114300" wp14:anchorId="1493BD1F" wp14:editId="02CAFBE6">
-                      <wp:extent cx="1638300" cy="346177"/>
-                      <wp:effectExtent l="0" t="0" r="0" b="0"/>
-                      <wp:docPr id="1" name="Agrupar 1"/>
-                      <wp:cNvGraphicFramePr/>
-                      <a:graphic xmlns:a="http://schemas.openxmlformats.org/drawingml/2006/main">
-                        <a:graphicData uri="http://schemas.microsoft.com/office/word/2010/wordprocessingGroup">
-                          <wpg:wgp>
-                            <wpg:cNvGrpSpPr/>
-                            <wpg:grpSpPr>
-                              <a:xfrm>
-                                <a:off x="0" y="0"/>
-                                <a:ext cx="1638300" cy="346177"/>
-                                <a:chOff x="0" y="0"/>
-                                <a:chExt cx="1638300" cy="346177"/>
-                              </a:xfrm>
-                            </wpg:grpSpPr>
-                            <wps:wsp>
-                              <wps:cNvPr id="2125703925" name="Retângulo 2125703925"/>
-                              <wps:cNvSpPr/>
-                              <wps:spPr>
-                                <a:xfrm>
-                                  <a:off x="0" y="0"/>
-                                  <a:ext cx="1638300" cy="346177"/>
-                                </a:xfrm>
-                                <a:prstGeom prst="rect">
-                                  <a:avLst/>
-                                </a:prstGeom>
-                                <a:noFill/>
-                              </wps:spPr>
-                              <wps:bodyPr/>
-                            </wps:wsp>
-                            <wps:wsp>
-                              <wps:cNvPr id="1620907856" name="Conector reto 1620907856"/>
-                              <wps:cNvCnPr/>
-                              <wps:spPr>
-                                <a:xfrm>
-                                  <a:off x="0" y="346177"/>
-                                  <a:ext cx="1638300" cy="0"/>
-                                </a:xfrm>
-                                <a:prstGeom prst="line">
-                                  <a:avLst/>
-                                </a:prstGeom>
-                                <a:noFill/>
-                                <a:ln w="23812">
-                                  <a:solidFill>
-                                    <a:srgbClr val="000000"/>
-                                  </a:solidFill>
-                                </a:ln>
-                              </wps:spPr>
-                              <wps:bodyPr/>
-                            </wps:wsp>
-                          </wpg:wgp>
-                        </a:graphicData>
-                      </a:graphic>
-                    </wp:inline>
-                  </w:drawing>
-                </mc:Choice>
-                <mc:Fallback xmlns:cr="http://schemas.microsoft.com/office/comments/2020/reactions" xmlns="http://schemas.microsoft.com/office/tasks/2019/documenttasks" xmlns:dgm="http://schemas.openxmlformats.org/drawingml/2006/diagram" xmlns:lc="http://schemas.openxmlformats.org/drawingml/2006/lockedCanvas" xmlns:c="http://schemas.openxmlformats.org/drawingml/2006/chart" xmlns:pic="http://schemas.openxmlformats.org/drawingml/2006/picture" xmlns:a="http://schemas.openxmlformats.org/drawingml/2006/main" xmlns:sl="http://schemas.openxmlformats.org/schemaLibrary/2006/main">
-                  <w:drawing>
-                    <wp:inline>
-                      <wp:extent cx="0" cy="0"/>
-                      <wp:docPr id="0"/>
-                      <a:graphic>
-                        <a:graphicData/>
-                      </a:graphic>
-                    </wp:inline>
-                  </w:drawing>
-                </mc:Fallback>
-              </mc:AlternateContent>
-            </w:r>
-          </w:p>
-        </w:tc>
-      </w:tr>
-      <w:tr>
-        <w:trPr>
-          <w:cantSplit/>
-          <w:trHeight w:val="838"/>
-          <w:jc w:val="center"/>
-        </w:trPr>
-        <w:tc>
-          <w:tcPr>
-            <w:tcW w:w="4320" w:type="dxa"/>
-            <w:vMerge/>
-            <w:tcMar>
-              <w:top w:w="100" w:type="dxa"/>
-              <w:left w:w="100" w:type="dxa"/>
-              <w:bottom w:w="100" w:type="dxa"/>
-              <w:right w:w="100" w:type="dxa"/>
-            </w:tcMar>
-          </w:tcPr>
-          <w:p>
-            <w:pPr>
-              <w:widowControl w:val="0"/>
-              <w:spacing w:line="240" w:lineRule="auto"/>
-              <w:rPr>
-                <w:color w:val="11437E"/>
-                <w:sz w:val="28"/>
-                <w:szCs w:val="28"/>
-              </w:rPr>
-            </w:pPr>
-          </w:p>
-        </w:tc>
-        <w:tc>
-          <w:tcPr>
-            <w:tcW w:w="1995" w:type="dxa"/>
-            <w:tcMar>
-              <w:top w:w="100" w:type="dxa"/>
-              <w:left w:w="100" w:type="dxa"/>
-              <w:bottom w:w="100" w:type="dxa"/>
-              <w:right w:w="100" w:type="dxa"/>
-            </w:tcMar>
-          </w:tcPr>
-          <w:p>
-            <w:pPr>
-              <w:widowControl w:val="0"/>
-              <w:spacing w:line="240" w:lineRule="auto"/>
-              <w:rPr>
-                <w:b/>
-                <w:bCs/>
-                <w:sz w:val="28"/>
-                <w:szCs w:val="28"/>
-              </w:rPr>
-            </w:pPr>
-          </w:p>
-        </w:tc>
-        <w:tc>
-          <w:tcPr>
-            <w:tcW w:w="4020" w:type="dxa"/>
-            <w:vMerge/>
-            <w:tcMar>
-              <w:top w:w="100" w:type="dxa"/>
-              <w:left w:w="100" w:type="dxa"/>
-              <w:bottom w:w="100" w:type="dxa"/>
-              <w:right w:w="100" w:type="dxa"/>
-            </w:tcMar>
-          </w:tcPr>
-          <w:p>
-            <w:pPr>
-              <w:widowControl w:val="0"/>
-              <w:spacing w:line="240" w:lineRule="auto"/>
-              <w:rPr>
-                <w:sz w:val="28"/>
-                <w:szCs w:val="28"/>
-              </w:rPr>
-            </w:pPr>
-          </w:p>
-        </w:tc>
-      </w:tr>
-      <w:tr>
-        <w:trPr>
-          <w:cantSplit/>
-          <w:trHeight w:val="156"/>
-          <w:jc w:val="center"/>
-        </w:trPr>
-        <w:tc>
-          <w:tcPr>
-            <w:tcW w:w="4320" w:type="dxa"/>
-            <w:vMerge/>
-            <w:tcMar>
-              <w:top w:w="100" w:type="dxa"/>
-              <w:left w:w="100" w:type="dxa"/>
-              <w:bottom w:w="100" w:type="dxa"/>
-              <w:right w:w="100" w:type="dxa"/>
-            </w:tcMar>
-          </w:tcPr>
-          <w:p>
-            <w:pPr>
-              <w:widowControl w:val="0"/>
-              <w:spacing w:line="240" w:lineRule="auto"/>
-              <w:rPr>
-                <w:color w:val="11437E"/>
-                <w:sz w:val="28"/>
-                <w:szCs w:val="28"/>
-              </w:rPr>
-            </w:pPr>
-          </w:p>
-        </w:tc>
-        <w:tc>
-          <w:tcPr>
-            <w:tcW w:w="1995" w:type="dxa"/>
-            <w:tcMar>
-              <w:top w:w="100" w:type="dxa"/>
-              <w:left w:w="100" w:type="dxa"/>
-              <w:bottom w:w="100" w:type="dxa"/>
-              <w:right w:w="100" w:type="dxa"/>
-            </w:tcMar>
-          </w:tcPr>
-          <w:p>
-            <w:pPr>
-              <w:widowControl w:val="0"/>
-              <w:spacing w:line="240" w:lineRule="auto"/>
-              <w:rPr>
-                <w:b/>
-                <w:bCs/>
-                <w:sz w:val="28"/>
-                <w:szCs w:val="28"/>
-              </w:rPr>
-            </w:pPr>
-          </w:p>
-        </w:tc>
-        <w:tc>
-          <w:tcPr>
-            <w:tcW w:w="4020" w:type="dxa"/>
-            <w:vMerge/>
-            <w:tcMar>
-              <w:top w:w="100" w:type="dxa"/>
-              <w:left w:w="100" w:type="dxa"/>
-              <w:bottom w:w="100" w:type="dxa"/>
-              <w:right w:w="100" w:type="dxa"/>
-            </w:tcMar>
-          </w:tcPr>
-          <w:p>
-            <w:pPr>
-              <w:widowControl w:val="0"/>
-              <w:spacing w:line="240" w:lineRule="auto"/>
-              <w:rPr>
-                <w:sz w:val="28"/>
-                <w:szCs w:val="28"/>
-              </w:rPr>
-            </w:pPr>
           </w:p>
         </w:tc>
       </w:tr>

</xml_diff>